<commit_message>
Final changes for CA 5
</commit_message>
<xml_diff>
--- a/Emails and word documents/Email to client CA 3.docx
+++ b/Emails and word documents/Email to client CA 3.docx
@@ -4,7 +4,7 @@
   <w:body>
     <w:p>
       <w:r>
-        <w:t xml:space="preserve"> Good day Sofia Martinez.</w:t>
+        <w:t>Good day Sofia Martinez.</w:t>
       </w:r>
     </w:p>
     <w:p/>
@@ -263,19 +263,7 @@
           <w:rPr>
             <w:rStyle w:val="Hyperlink"/>
           </w:rPr>
-          <w:t>https://defany.github.io/WebDev_Project_</w:t>
-        </w:r>
-        <w:r>
-          <w:rPr>
-            <w:rStyle w:val="Hyperlink"/>
-          </w:rPr>
-          <w:t>H</w:t>
-        </w:r>
-        <w:r>
-          <w:rPr>
-            <w:rStyle w:val="Hyperlink"/>
-          </w:rPr>
-          <w:t>tmlKings/index.html</w:t>
+          <w:t>https://defany.github.io/WebDev_Project_HtmlKings/index.html</w:t>
         </w:r>
       </w:hyperlink>
       <w:r>
@@ -1075,6 +1063,7 @@
   <w:style w:type="character" w:default="1" w:styleId="DefaultParagraphFont">
     <w:name w:val="Default Paragraph Font"/>
     <w:uiPriority w:val="1"/>
+    <w:semiHidden/>
     <w:unhideWhenUsed/>
   </w:style>
   <w:style w:type="table" w:default="1" w:styleId="TableNormal">

</xml_diff>